<commit_message>
Update: Nio Vorlage – {{STELLPLATZ}} Platzhalter korrigiert
</commit_message>
<xml_diff>
--- a/AMBA_Betreibervertrag_NIO_Vorlage.docx
+++ b/AMBA_Betreibervertrag_NIO_Vorlage.docx
@@ -117,7 +117,6 @@
           <w:szCs w:val="20"/>
         </w:rPr>
       </w:pPr>
-      <w:proofErr w:type="spellStart"/>
       <w:r>
         <w:rPr>
           <w:rFonts w:cstheme="majorHAnsi"/>
@@ -125,9 +124,8 @@
           <w:sz w:val="20"/>
           <w:szCs w:val="20"/>
         </w:rPr>
-        <w:t>amba</w:t>
-      </w:r>
-      <w:proofErr w:type="spellEnd"/>
+        <w:t>amba operations</w:t>
+      </w:r>
       <w:r>
         <w:rPr>
           <w:rFonts w:cstheme="majorHAnsi"/>
@@ -135,9 +133,8 @@
           <w:sz w:val="20"/>
           <w:szCs w:val="20"/>
         </w:rPr>
-        <w:t xml:space="preserve"> </w:t>
-      </w:r>
-      <w:proofErr w:type="spellStart"/>
+        <w:t xml:space="preserve"> Gmb</w:t>
+      </w:r>
       <w:r>
         <w:rPr>
           <w:rFonts w:cstheme="majorHAnsi"/>
@@ -145,9 +142,8 @@
           <w:sz w:val="20"/>
           <w:szCs w:val="20"/>
         </w:rPr>
-        <w:t>operations</w:t>
-      </w:r>
-      <w:proofErr w:type="spellEnd"/>
+        <w:t>H</w:t>
+      </w:r>
       <w:r>
         <w:rPr>
           <w:rFonts w:cstheme="majorHAnsi"/>
@@ -155,7 +151,7 @@
           <w:sz w:val="20"/>
           <w:szCs w:val="20"/>
         </w:rPr>
-        <w:t xml:space="preserve"> Gmb</w:t>
+        <w:t xml:space="preserve">, </w:t>
       </w:r>
       <w:r>
         <w:rPr>
@@ -164,7 +160,7 @@
           <w:sz w:val="20"/>
           <w:szCs w:val="20"/>
         </w:rPr>
-        <w:t>H</w:t>
+        <w:t>Obere Weidenstrass</w:t>
       </w:r>
       <w:r>
         <w:rPr>
@@ -173,37 +169,8 @@
           <w:sz w:val="20"/>
           <w:szCs w:val="20"/>
         </w:rPr>
-        <w:t xml:space="preserve">, </w:t>
-      </w:r>
-      <w:r>
-        <w:rPr>
-          <w:rFonts w:cstheme="majorHAnsi"/>
-          <w:b/>
-          <w:sz w:val="20"/>
-          <w:szCs w:val="20"/>
-        </w:rPr>
-        <w:t xml:space="preserve">Obere </w:t>
-      </w:r>
-      <w:proofErr w:type="spellStart"/>
-      <w:r>
-        <w:rPr>
-          <w:rFonts w:cstheme="majorHAnsi"/>
-          <w:b/>
-          <w:sz w:val="20"/>
-          <w:szCs w:val="20"/>
-        </w:rPr>
-        <w:t>Weidenstrass</w:t>
-      </w:r>
-      <w:r>
-        <w:rPr>
-          <w:rFonts w:cstheme="majorHAnsi"/>
-          <w:b/>
-          <w:sz w:val="20"/>
-          <w:szCs w:val="20"/>
-        </w:rPr>
         <w:t>e</w:t>
       </w:r>
-      <w:proofErr w:type="spellEnd"/>
       <w:r>
         <w:rPr>
           <w:rFonts w:cstheme="majorHAnsi"/>
@@ -377,7 +344,7 @@
           <w:bCs/>
           <w:szCs w:val="20"/>
         </w:rPr>
-        <w:t>{{STELLPLATZ</w:t>
+        <w:t xml:space="preserve">Stellplatznummer </w:t>
       </w:r>
       <w:r>
         <w:rPr>
@@ -386,16 +353,7 @@
           <w:bCs/>
           <w:szCs w:val="20"/>
         </w:rPr>
-        <w:t>_NUMMER</w:t>
-      </w:r>
-      <w:r>
-        <w:rPr>
-          <w:rFonts w:cstheme="majorHAnsi"/>
-          <w:b/>
-          <w:bCs/>
-          <w:szCs w:val="20"/>
-        </w:rPr>
-        <w:t>}}</w:t>
+        <w:t>{{STELLPLATZ}}</w:t>
       </w:r>
     </w:p>
     <w:bookmarkEnd w:id="0"/>
@@ -1158,7 +1116,6 @@
         </w:rPr>
         <w:t xml:space="preserve"> der </w:t>
       </w:r>
-      <w:proofErr w:type="gramStart"/>
       <w:r>
         <w:rPr>
           <w:rFonts w:cstheme="majorHAnsi"/>
@@ -1178,15 +1135,7 @@
           <w:rFonts w:cstheme="majorHAnsi"/>
           <w:szCs w:val="20"/>
         </w:rPr>
-        <w:t>er</w:t>
-      </w:r>
-      <w:proofErr w:type="gramEnd"/>
-      <w:r>
-        <w:rPr>
-          <w:rFonts w:cstheme="majorHAnsi"/>
-          <w:szCs w:val="20"/>
-        </w:rPr>
-        <w:t xml:space="preserve"> </w:t>
+        <w:t xml:space="preserve">er </w:t>
       </w:r>
       <w:r>
         <w:rPr>
@@ -1195,21 +1144,12 @@
         </w:rPr>
         <w:t xml:space="preserve">dem </w:t>
       </w:r>
-      <w:proofErr w:type="spellStart"/>
-      <w:r>
-        <w:rPr>
-          <w:rFonts w:cstheme="majorHAnsi"/>
-          <w:szCs w:val="20"/>
-        </w:rPr>
-        <w:t>dem</w:t>
-      </w:r>
-      <w:proofErr w:type="spellEnd"/>
-      <w:r>
-        <w:rPr>
-          <w:rFonts w:cstheme="majorHAnsi"/>
-          <w:szCs w:val="20"/>
-        </w:rPr>
-        <w:t xml:space="preserve"> Eigentümer</w:t>
+      <w:r>
+        <w:rPr>
+          <w:rFonts w:cstheme="majorHAnsi"/>
+          <w:szCs w:val="20"/>
+        </w:rPr>
+        <w:t>dem Eigentümer</w:t>
       </w:r>
       <w:r>
         <w:rPr>
@@ -1629,21 +1569,12 @@
         </w:rPr>
         <w:t xml:space="preserve">voraussichtliche </w:t>
       </w:r>
-      <w:proofErr w:type="spellStart"/>
-      <w:r>
-        <w:rPr>
-          <w:rFonts w:cstheme="majorHAnsi"/>
-          <w:szCs w:val="20"/>
-        </w:rPr>
-        <w:t>Inbetriebnahmetermin</w:t>
-      </w:r>
-      <w:proofErr w:type="spellEnd"/>
-      <w:r>
-        <w:rPr>
-          <w:rFonts w:cstheme="majorHAnsi"/>
-          <w:szCs w:val="20"/>
-        </w:rPr>
-        <w:t xml:space="preserve"> </w:t>
+      <w:r>
+        <w:rPr>
+          <w:rFonts w:cstheme="majorHAnsi"/>
+          <w:szCs w:val="20"/>
+        </w:rPr>
+        <w:t xml:space="preserve">Inbetriebnahmetermin </w:t>
       </w:r>
       <w:r>
         <w:rPr>
@@ -2107,23 +2038,7 @@
           <w:rFonts w:cstheme="majorHAnsi"/>
           <w:szCs w:val="20"/>
         </w:rPr>
-        <w:t xml:space="preserve"> d. Remote-Kontrolle der Funktionsfähigkeit und Identifizierung von Störungen über die Verwaltungssoftware gegebenenfalls </w:t>
-      </w:r>
-      <w:proofErr w:type="gramStart"/>
-      <w:r>
-        <w:rPr>
-          <w:rFonts w:cstheme="majorHAnsi"/>
-          <w:szCs w:val="20"/>
-        </w:rPr>
-        <w:t>mittels vorkonfiguriertem Router</w:t>
-      </w:r>
-      <w:proofErr w:type="gramEnd"/>
-      <w:r>
-        <w:rPr>
-          <w:rFonts w:cstheme="majorHAnsi"/>
-          <w:szCs w:val="20"/>
-        </w:rPr>
-        <w:t xml:space="preserve"> des </w:t>
+        <w:t xml:space="preserve"> d. Remote-Kontrolle der Funktionsfähigkeit und Identifizierung von Störungen über die Verwaltungssoftware gegebenenfalls mittels vorkonfiguriertem Router des </w:t>
       </w:r>
       <w:r>
         <w:rPr>
@@ -2771,7 +2686,7 @@
           <w:rFonts w:cstheme="majorHAnsi"/>
           <w:szCs w:val="20"/>
         </w:rPr>
-        <w:t xml:space="preserve"> hat das Recht und die Pflicht, alle notwendigen Maßnahmen zu treffen, um den sicheren und ordnungsgemäßen Betrieb nach den einschlägigen Rechtsvorschriften und den allgemein </w:t>
+        <w:t xml:space="preserve"> hat das Recht und die Pflicht, alle notwendigen Maßnahmen zu treffen, um den sicheren und ordnungsgemäßen Betrieb nach den einschlägigen Rechtsvorschriften und den allgemein aner</w:t>
       </w:r>
       <w:r>
         <w:rPr>
@@ -2779,7 +2694,7 @@
           <w:szCs w:val="20"/>
         </w:rPr>
         <w:lastRenderedPageBreak/>
-        <w:t xml:space="preserve">anerkannten Regeln der Technik (§ 49 EnWG) aufrechtzuerhalten oder wiederherzustellen. Bei Gefahr in Verzug ist der </w:t>
+        <w:t xml:space="preserve">kannten Regeln der Technik (§ 49 EnWG) aufrechtzuerhalten oder wiederherzustellen. Bei Gefahr in Verzug ist der </w:t>
       </w:r>
       <w:r>
         <w:rPr>
@@ -3195,14 +3110,14 @@
           <w:rFonts w:cstheme="majorHAnsi"/>
           <w:szCs w:val="20"/>
         </w:rPr>
-        <w:t xml:space="preserve"> Verzug vorliegt; in diesem Fall muss die </w:t>
-      </w:r>
-      <w:r>
-        <w:rPr>
-          <w:rFonts w:cstheme="majorHAnsi"/>
-          <w:szCs w:val="20"/>
-        </w:rPr>
-        <w:t>Mitteilung unverzüglich nachgeholt werden und Anlass, Zeit und Umfang der durchgeführten Maßnahmen enthalten.</w:t>
+        <w:t xml:space="preserve"> Verzug vorliegt; in diesem Fall muss die Mit</w:t>
+      </w:r>
+      <w:r>
+        <w:rPr>
+          <w:rFonts w:cstheme="majorHAnsi"/>
+          <w:szCs w:val="20"/>
+        </w:rPr>
+        <w:t>teilung unverzüglich nachgeholt werden und Anlass, Zeit und Umfang der durchgeführten Maßnahmen enthalten.</w:t>
       </w:r>
     </w:p>
     <w:p>
@@ -3608,39 +3523,7 @@
           <w:rFonts w:cstheme="majorHAnsi"/>
           <w:szCs w:val="20"/>
         </w:rPr>
-        <w:t>Hard-</w:t>
-      </w:r>
-      <w:proofErr w:type="spellStart"/>
-      <w:r>
-        <w:rPr>
-          <w:rFonts w:cstheme="majorHAnsi"/>
-          <w:szCs w:val="20"/>
-        </w:rPr>
-        <w:t>Reset</w:t>
-      </w:r>
-      <w:proofErr w:type="spellEnd"/>
-      <w:r>
-        <w:rPr>
-          <w:rFonts w:cstheme="majorHAnsi"/>
-          <w:szCs w:val="20"/>
-        </w:rPr>
-        <w:t xml:space="preserve">, Aus- und </w:t>
-      </w:r>
-      <w:proofErr w:type="spellStart"/>
-      <w:r>
-        <w:rPr>
-          <w:rFonts w:cstheme="majorHAnsi"/>
-          <w:szCs w:val="20"/>
-        </w:rPr>
-        <w:t>Einsichern</w:t>
-      </w:r>
-      <w:proofErr w:type="spellEnd"/>
-      <w:r>
-        <w:rPr>
-          <w:rFonts w:cstheme="majorHAnsi"/>
-          <w:szCs w:val="20"/>
-        </w:rPr>
-        <w:t xml:space="preserve"> </w:t>
+        <w:t xml:space="preserve">Hard-Reset, Aus- und Einsichern </w:t>
       </w:r>
       <w:r>
         <w:rPr>
@@ -3984,7 +3867,7 @@
           <w:rFonts w:cstheme="majorHAnsi"/>
           <w:szCs w:val="20"/>
         </w:rPr>
-        <w:t xml:space="preserve">zur Störungsbehebung </w:t>
+        <w:t>zur Störungsbehebung er</w:t>
       </w:r>
       <w:r>
         <w:rPr>
@@ -3992,7 +3875,7 @@
           <w:szCs w:val="20"/>
         </w:rPr>
         <w:lastRenderedPageBreak/>
-        <w:t xml:space="preserve">erfolgt </w:t>
+        <w:t xml:space="preserve">folgt </w:t>
       </w:r>
       <w:r>
         <w:rPr>
@@ -5275,31 +5158,13 @@
         </w:rPr>
         <w:tab/>
       </w:r>
-      <w:proofErr w:type="spellStart"/>
-      <w:r>
-        <w:rPr>
-          <w:rFonts w:cstheme="majorHAnsi"/>
-          <w:szCs w:val="20"/>
-        </w:rPr>
-        <w:t>amba</w:t>
-      </w:r>
-      <w:proofErr w:type="spellEnd"/>
-      <w:r>
-        <w:rPr>
-          <w:rFonts w:cstheme="majorHAnsi"/>
-          <w:szCs w:val="20"/>
-        </w:rPr>
-        <w:t xml:space="preserve"> </w:t>
-      </w:r>
-      <w:proofErr w:type="spellStart"/>
-      <w:r>
-        <w:rPr>
-          <w:rFonts w:cstheme="majorHAnsi"/>
-          <w:szCs w:val="20"/>
-        </w:rPr>
-        <w:t>operations</w:t>
-      </w:r>
-      <w:proofErr w:type="spellEnd"/>
+      <w:r>
+        <w:rPr>
+          <w:rFonts w:cstheme="majorHAnsi"/>
+          <w:szCs w:val="20"/>
+        </w:rPr>
+        <w:t>amba operations</w:t>
+      </w:r>
       <w:r>
         <w:rPr>
           <w:rFonts w:cstheme="majorHAnsi"/>
@@ -5396,21 +5261,12 @@
           <w:szCs w:val="20"/>
         </w:rPr>
       </w:pPr>
-      <w:proofErr w:type="spellStart"/>
-      <w:r>
-        <w:rPr>
-          <w:rFonts w:cstheme="majorHAnsi"/>
-          <w:szCs w:val="20"/>
-        </w:rPr>
-        <w:t>Vwz</w:t>
-      </w:r>
-      <w:proofErr w:type="spellEnd"/>
-      <w:r>
-        <w:rPr>
-          <w:rFonts w:cstheme="majorHAnsi"/>
-          <w:szCs w:val="20"/>
-        </w:rPr>
-        <w:t>.:</w:t>
+      <w:r>
+        <w:rPr>
+          <w:rFonts w:cstheme="majorHAnsi"/>
+          <w:szCs w:val="20"/>
+        </w:rPr>
+        <w:t>Vwz.:</w:t>
       </w:r>
       <w:r>
         <w:rPr>
@@ -5843,23 +5699,7 @@
           <w:rFonts w:cstheme="majorHAnsi"/>
           <w:szCs w:val="20"/>
         </w:rPr>
-        <w:t xml:space="preserve">Anhaltspunkte bestehen, dass sich Dritte anderweitig Zugang </w:t>
-      </w:r>
-      <w:proofErr w:type="gramStart"/>
-      <w:r>
-        <w:rPr>
-          <w:rFonts w:cstheme="majorHAnsi"/>
-          <w:szCs w:val="20"/>
-        </w:rPr>
-        <w:t>zu</w:t>
-      </w:r>
-      <w:proofErr w:type="gramEnd"/>
-      <w:r>
-        <w:rPr>
-          <w:rFonts w:cstheme="majorHAnsi"/>
-          <w:szCs w:val="20"/>
-        </w:rPr>
-        <w:t xml:space="preserve"> der dem Kunden bereitgestellten Anwendung verschafft haben;</w:t>
+        <w:t>Anhaltspunkte bestehen, dass sich Dritte anderweitig Zugang zu der dem Kunden bereitgestellten Anwendung verschafft haben;</w:t>
       </w:r>
     </w:p>
     <w:p>
@@ -6127,7 +5967,7 @@
           <w:rFonts w:cstheme="majorHAnsi"/>
           <w:szCs w:val="20"/>
         </w:rPr>
-        <w:t xml:space="preserve"> vor Inkrafttreten der Sperrung, in Text- oder Schriftform ankündigen, soweit die Ankündigung unter Abwägung der beiderseitigen Interessen </w:t>
+        <w:t xml:space="preserve"> vor Inkrafttreten der Sperrung, in Text- oder Schriftform ankündigen, soweit die Ankündigung unter Abwägung der beiderseitigen Interessen zu</w:t>
       </w:r>
       <w:r>
         <w:rPr>
@@ -6135,7 +5975,7 @@
           <w:szCs w:val="20"/>
         </w:rPr>
         <w:lastRenderedPageBreak/>
-        <w:t>zumutbar und mit dem Zweck der Sperrung vereinbar ist.</w:t>
+        <w:t>mutbar und mit dem Zweck der Sperrung vereinbar ist.</w:t>
       </w:r>
     </w:p>
     <w:p>
@@ -6218,14 +6058,14 @@
           <w:rFonts w:cstheme="majorHAnsi"/>
           <w:szCs w:val="20"/>
         </w:rPr>
-        <w:t xml:space="preserve">ie Haftung der Vertragspartner sowie ihrer Erfüllungs- und Verrichtungsgehilfen für schuldhaft verursachte Schäden ausgeschlossen, soweit der Schaden nicht durch Vorsatz oder grobe Fahrlässigkeit herbeigeführt wurde. Dies gilt nicht für Schäden aus der Verletzung des Lebens, des Körpers oder der Gesundheit oder der schuldhaften Verletzung wesentlicher Vertragspflichten, d. h. solcher Pflichten, deren Erfüllung die ordnungsgemäße Durchführung des Vertrages überhaupt erst ermöglicht und auf deren Einhaltung der </w:t>
-      </w:r>
-      <w:r>
-        <w:rPr>
-          <w:rFonts w:cstheme="majorHAnsi"/>
-          <w:szCs w:val="20"/>
-        </w:rPr>
-        <w:t>Vertragspartner regelmäßig vertrauen darf (sog. Kardinalpflichten).</w:t>
+        <w:t>ie Haftung der Vertragspartner sowie ihrer Erfüllungs- und Verrichtungsgehilfen für schuldhaft verursachte Schäden ausgeschlossen, soweit der Schaden nicht durch Vorsatz oder grobe Fahrlässigkeit herbeigeführt wurde. Dies gilt nicht für Schäden aus der Verletzung des Lebens, des Körpers oder der Gesundheit oder der schuldhaften Verletzung wesentlicher Vertragspflichten, d. h. solcher Pflichten, deren Erfüllung die ordnungsgemäße Durchführung des Vertrages überhaupt erst ermöglicht und auf deren Einhaltung der Vertrags</w:t>
+      </w:r>
+      <w:r>
+        <w:rPr>
+          <w:rFonts w:cstheme="majorHAnsi"/>
+          <w:szCs w:val="20"/>
+        </w:rPr>
+        <w:t>partner regelmäßig vertrauen darf (sog. Kardinalpflichten).</w:t>
       </w:r>
       <w:bookmarkEnd w:id="34"/>
     </w:p>
@@ -6557,23 +6397,7 @@
           <w:szCs w:val="20"/>
         </w:rPr>
         <w:lastRenderedPageBreak/>
-        <w:t xml:space="preserve">Sofern die Internetanbindung via SIM-Karte umgesetzt wird, ist der Kunde des Weiteren verpflichtet nach Beendigung dieses Vertrags, die laut § 6 Abs. 1 </w:t>
-      </w:r>
-      <w:proofErr w:type="spellStart"/>
-      <w:r>
-        <w:rPr>
-          <w:rFonts w:cstheme="majorHAnsi"/>
-          <w:szCs w:val="20"/>
-        </w:rPr>
-        <w:t>lit</w:t>
-      </w:r>
-      <w:proofErr w:type="spellEnd"/>
-      <w:r>
-        <w:rPr>
-          <w:rFonts w:cstheme="majorHAnsi"/>
-          <w:szCs w:val="20"/>
-        </w:rPr>
-        <w:t>. b durch den Betriebsführer zur Verfügung gestellten SIM-Karten auf seine Kosten an den Betriebsführer zurückzugeben.</w:t>
+        <w:t>Sofern die Internetanbindung via SIM-Karte umgesetzt wird, ist der Kunde des Weiteren verpflichtet nach Beendigung dieses Vertrags, die laut § 6 Abs. 1 lit. b durch den Betriebsführer zur Verfügung gestellten SIM-Karten auf seine Kosten an den Betriebsführer zurückzugeben.</w:t>
       </w:r>
       <w:bookmarkEnd w:id="36"/>
     </w:p>
@@ -6855,37 +6679,12 @@
         </w:rPr>
         <w:t xml:space="preserve">B. Ladesäulenverordnung, </w:t>
       </w:r>
-      <w:proofErr w:type="spellStart"/>
-      <w:r>
-        <w:rPr>
-          <w:rFonts w:cstheme="majorHAnsi"/>
-          <w:szCs w:val="20"/>
-        </w:rPr>
-        <w:t>MessEG</w:t>
-      </w:r>
-      <w:proofErr w:type="spellEnd"/>
-      <w:r>
-        <w:rPr>
-          <w:rFonts w:cstheme="majorHAnsi"/>
-          <w:szCs w:val="20"/>
-        </w:rPr>
-        <w:t xml:space="preserve">, </w:t>
-      </w:r>
-      <w:proofErr w:type="spellStart"/>
-      <w:r>
-        <w:rPr>
-          <w:rFonts w:cstheme="majorHAnsi"/>
-          <w:szCs w:val="20"/>
-        </w:rPr>
-        <w:t>MessEV</w:t>
-      </w:r>
-      <w:proofErr w:type="spellEnd"/>
-      <w:r>
-        <w:rPr>
-          <w:rFonts w:cstheme="majorHAnsi"/>
-          <w:szCs w:val="20"/>
-        </w:rPr>
-        <w:t xml:space="preserve">, </w:t>
+      <w:r>
+        <w:rPr>
+          <w:rFonts w:cstheme="majorHAnsi"/>
+          <w:szCs w:val="20"/>
+        </w:rPr>
+        <w:t xml:space="preserve">MessEG, MessEV, </w:t>
       </w:r>
       <w:r>
         <w:rPr>
@@ -7328,14 +7127,14 @@
           <w:rFonts w:cstheme="majorHAnsi"/>
           <w:szCs w:val="20"/>
         </w:rPr>
-        <w:t xml:space="preserve">personenbezogene Daten betroffener Personen von einem Vertragspartner an den jeweils </w:t>
-      </w:r>
-      <w:r>
-        <w:rPr>
-          <w:rFonts w:cstheme="majorHAnsi"/>
-          <w:szCs w:val="20"/>
-        </w:rPr>
-        <w:t xml:space="preserve">anderen Vertragspartner weitergeben werden und/oder </w:t>
+        <w:t>personenbezogene Daten betroffener Personen von einem Vertragspartner an den jeweils ande</w:t>
+      </w:r>
+      <w:r>
+        <w:rPr>
+          <w:rFonts w:cstheme="majorHAnsi"/>
+          <w:szCs w:val="20"/>
+        </w:rPr>
+        <w:t xml:space="preserve">ren Vertragspartner weitergeben werden und/oder </w:t>
       </w:r>
     </w:p>
     <w:p>
@@ -7371,23 +7170,7 @@
           <w:rFonts w:cstheme="majorHAnsi"/>
           <w:szCs w:val="20"/>
         </w:rPr>
-        <w:t xml:space="preserve">Hierfür verwendet der Vertragspartner, der die personenbezogenen Daten weitergibt bzw. auf dessen Veranlassung die Kontaktaufnahme erfolgt, </w:t>
-      </w:r>
-      <w:proofErr w:type="gramStart"/>
-      <w:r>
-        <w:rPr>
-          <w:rFonts w:cstheme="majorHAnsi"/>
-          <w:szCs w:val="20"/>
-        </w:rPr>
-        <w:t>das</w:t>
-      </w:r>
-      <w:proofErr w:type="gramEnd"/>
-      <w:r>
-        <w:rPr>
-          <w:rFonts w:cstheme="majorHAnsi"/>
-          <w:szCs w:val="20"/>
-        </w:rPr>
-        <w:t xml:space="preserve"> ihm vom anderen Vertragspartner zur Verfügung gestellte Informationsblatt. Die „</w:t>
+        <w:t>Hierfür verwendet der Vertragspartner, der die personenbezogenen Daten weitergibt bzw. auf dessen Veranlassung die Kontaktaufnahme erfolgt, das ihm vom anderen Vertragspartner zur Verfügung gestellte Informationsblatt. Die „</w:t>
       </w:r>
       <w:r>
         <w:rPr>
@@ -8076,31 +7859,13 @@
         </w:rPr>
         <w:t xml:space="preserve"> (</w:t>
       </w:r>
-      <w:proofErr w:type="spellStart"/>
-      <w:r>
-        <w:rPr>
-          <w:rFonts w:cstheme="majorHAnsi"/>
-          <w:szCs w:val="20"/>
-        </w:rPr>
-        <w:t>amba</w:t>
-      </w:r>
-      <w:proofErr w:type="spellEnd"/>
-      <w:r>
-        <w:rPr>
-          <w:rFonts w:cstheme="majorHAnsi"/>
-          <w:szCs w:val="20"/>
-        </w:rPr>
-        <w:t xml:space="preserve"> </w:t>
-      </w:r>
-      <w:proofErr w:type="spellStart"/>
-      <w:r>
-        <w:rPr>
-          <w:rFonts w:cstheme="majorHAnsi"/>
-          <w:szCs w:val="20"/>
-        </w:rPr>
-        <w:t>operations</w:t>
-      </w:r>
-      <w:proofErr w:type="spellEnd"/>
+      <w:r>
+        <w:rPr>
+          <w:rFonts w:cstheme="majorHAnsi"/>
+          <w:szCs w:val="20"/>
+        </w:rPr>
+        <w:t>amba operations</w:t>
+      </w:r>
       <w:r>
         <w:rPr>
           <w:rFonts w:cstheme="majorHAnsi"/>
@@ -8685,21 +8450,7 @@
           <w:rFonts w:cstheme="majorHAnsi"/>
         </w:rPr>
         <w:tab/>
-        <w:t>{{KUNDE_</w:t>
-      </w:r>
-      <w:proofErr w:type="gramStart"/>
-      <w:r>
-        <w:rPr>
-          <w:rFonts w:cstheme="majorHAnsi"/>
-        </w:rPr>
-        <w:t>EMAIL</w:t>
-      </w:r>
-      <w:proofErr w:type="gramEnd"/>
-      <w:r>
-        <w:rPr>
-          <w:rFonts w:cstheme="majorHAnsi"/>
-        </w:rPr>
-        <w:t>}}</w:t>
+        <w:t>{{KUNDE_EMAIL}}</w:t>
       </w:r>
     </w:p>
     <w:bookmarkEnd w:id="48"/>
@@ -9143,7 +8894,6 @@
                 <w:szCs w:val="18"/>
               </w:rPr>
             </w:pPr>
-            <w:proofErr w:type="spellStart"/>
             <w:r>
               <w:rPr>
                 <w:rFonts w:cstheme="majorHAnsi"/>
@@ -9153,7 +8903,6 @@
               </w:rPr>
               <w:t>Inbetriebnahmedatum</w:t>
             </w:r>
-            <w:proofErr w:type="spellEnd"/>
           </w:p>
         </w:tc>
       </w:tr>
@@ -9781,21 +9530,7 @@
         <w:rPr>
           <w:rFonts w:cstheme="majorHAnsi"/>
         </w:rPr>
-        <w:t xml:space="preserve">AMBA </w:t>
-      </w:r>
-      <w:proofErr w:type="spellStart"/>
-      <w:r>
-        <w:rPr>
-          <w:rFonts w:cstheme="majorHAnsi"/>
-        </w:rPr>
-        <w:t>Operations</w:t>
-      </w:r>
-      <w:proofErr w:type="spellEnd"/>
-      <w:r>
-        <w:rPr>
-          <w:rFonts w:cstheme="majorHAnsi"/>
-        </w:rPr>
-        <w:t xml:space="preserve"> GmbH, Obere Weidenstraße 2, 81543 München.</w:t>
+        <w:t>AMBA Operations GmbH, Obere Weidenstraße 2, 81543 München.</w:t>
       </w:r>
     </w:p>
     <w:p>
@@ -10057,23 +9792,7 @@
           <w:rFonts w:cstheme="majorHAnsi"/>
           <w:szCs w:val="20"/>
         </w:rPr>
-        <w:t xml:space="preserve">Erfüllung des Vertrags mit unserem Vertragspartner und die diesbezügliche Durchführung vorvertraglicher Maßnahmen auf Grundlage des Art. 6 Abs. 1 </w:t>
-      </w:r>
-      <w:proofErr w:type="spellStart"/>
-      <w:r>
-        <w:rPr>
-          <w:rFonts w:cstheme="majorHAnsi"/>
-          <w:szCs w:val="20"/>
-        </w:rPr>
-        <w:t>lit</w:t>
-      </w:r>
-      <w:proofErr w:type="spellEnd"/>
-      <w:r>
-        <w:rPr>
-          <w:rFonts w:cstheme="majorHAnsi"/>
-          <w:szCs w:val="20"/>
-        </w:rPr>
-        <w:t>. b) DS-GVO.</w:t>
+        <w:t>Erfüllung des Vertrags mit unserem Vertragspartner und die diesbezügliche Durchführung vorvertraglicher Maßnahmen auf Grundlage des Art. 6 Abs. 1 lit. b) DS-GVO.</w:t>
       </w:r>
     </w:p>
     <w:p>
@@ -10099,23 +9818,7 @@
           <w:rFonts w:cstheme="majorHAnsi"/>
           <w:szCs w:val="20"/>
         </w:rPr>
-        <w:t xml:space="preserve">Erfüllung rechtlicher Verpflichtungen (z. B. aus der Ladesäulenverordnung oder wegen handels- oder steuerrechtlicher Vorgaben) auf Grundlage von Art. 6 Abs. 1 </w:t>
-      </w:r>
-      <w:proofErr w:type="spellStart"/>
-      <w:r>
-        <w:rPr>
-          <w:rFonts w:cstheme="majorHAnsi"/>
-          <w:szCs w:val="20"/>
-        </w:rPr>
-        <w:t>lit</w:t>
-      </w:r>
-      <w:proofErr w:type="spellEnd"/>
-      <w:r>
-        <w:rPr>
-          <w:rFonts w:cstheme="majorHAnsi"/>
-          <w:szCs w:val="20"/>
-        </w:rPr>
-        <w:t>. c) DS-GVO.</w:t>
+        <w:t>Erfüllung rechtlicher Verpflichtungen (z. B. aus der Ladesäulenverordnung oder wegen handels- oder steuerrechtlicher Vorgaben) auf Grundlage von Art. 6 Abs. 1 lit. c) DS-GVO.</w:t>
       </w:r>
     </w:p>
     <w:p>
@@ -10141,23 +9844,7 @@
           <w:rFonts w:cstheme="majorHAnsi"/>
           <w:szCs w:val="20"/>
         </w:rPr>
-        <w:t xml:space="preserve">Wahrnehmung von Aufgaben, die im öffentlichen Interesse liegen (z. B. aus der Ladesäulenverordnung), auf Grundlage von Art. 6 Abs. 1 </w:t>
-      </w:r>
-      <w:proofErr w:type="spellStart"/>
-      <w:r>
-        <w:rPr>
-          <w:rFonts w:cstheme="majorHAnsi"/>
-          <w:szCs w:val="20"/>
-        </w:rPr>
-        <w:t>lit</w:t>
-      </w:r>
-      <w:proofErr w:type="spellEnd"/>
-      <w:r>
-        <w:rPr>
-          <w:rFonts w:cstheme="majorHAnsi"/>
-          <w:szCs w:val="20"/>
-        </w:rPr>
-        <w:t>. e) DS-GVO.</w:t>
+        <w:t>Wahrnehmung von Aufgaben, die im öffentlichen Interesse liegen (z. B. aus der Ladesäulenverordnung), auf Grundlage von Art. 6 Abs. 1 lit. e) DS-GVO.</w:t>
       </w:r>
     </w:p>
     <w:p>
@@ -10357,21 +10044,7 @@
         <w:rPr>
           <w:rFonts w:cstheme="majorHAnsi"/>
         </w:rPr>
-        <w:t xml:space="preserve"> genannten Zwecken </w:t>
-      </w:r>
-      <w:proofErr w:type="gramStart"/>
-      <w:r>
-        <w:rPr>
-          <w:rFonts w:cstheme="majorHAnsi"/>
-        </w:rPr>
-        <w:t>solange</w:t>
-      </w:r>
-      <w:proofErr w:type="gramEnd"/>
-      <w:r>
-        <w:rPr>
-          <w:rFonts w:cstheme="majorHAnsi"/>
-        </w:rPr>
-        <w:t xml:space="preserve"> gespeichert, wie dies für die Erfüllung dieser Zwecke erforderlich ist. Bestehen gesetzliche Aufbewahrungspflichten, insbesondere aus dem Handels- und Steuerrecht (§§ 147 AO, 257 HGB), sind wir verpflichtet, die Daten bis zum Ablauf dieser Fristen zu speichern.</w:t>
+        <w:t xml:space="preserve"> genannten Zwecken solange gespeichert, wie dies für die Erfüllung dieser Zwecke erforderlich ist. Bestehen gesetzliche Aufbewahrungspflichten, insbesondere aus dem Handels- und Steuerrecht (§§ 147 AO, 257 HGB), sind wir verpflichtet, die Daten bis zum Ablauf dieser Fristen zu speichern.</w:t>
       </w:r>
     </w:p>
     <w:p>
@@ -10658,23 +10331,7 @@
           <w:rFonts w:cstheme="majorHAnsi"/>
           <w:b/>
         </w:rPr>
-        <w:t xml:space="preserve">Erfolgt eine automatisierte Entscheidungsfindung einschließlich </w:t>
-      </w:r>
-      <w:proofErr w:type="spellStart"/>
-      <w:r>
-        <w:rPr>
-          <w:rFonts w:cstheme="majorHAnsi"/>
-          <w:b/>
-        </w:rPr>
-        <w:t>Profiling</w:t>
-      </w:r>
-      <w:proofErr w:type="spellEnd"/>
-      <w:r>
-        <w:rPr>
-          <w:rFonts w:cstheme="majorHAnsi"/>
-          <w:b/>
-        </w:rPr>
-        <w:t>?</w:t>
+        <w:t>Erfolgt eine automatisierte Entscheidungsfindung einschließlich Profiling?</w:t>
       </w:r>
     </w:p>
     <w:p>
@@ -10691,21 +10348,7 @@
         <w:rPr>
           <w:rFonts w:cstheme="majorHAnsi"/>
         </w:rPr>
-        <w:t xml:space="preserve">Zum Abschluss und zur Erfüllung des Vertrages mit unserem Kunden findet keine automatisierte Entscheidungsfindung einschließlich </w:t>
-      </w:r>
-      <w:proofErr w:type="spellStart"/>
-      <w:r>
-        <w:rPr>
-          <w:rFonts w:cstheme="majorHAnsi"/>
-        </w:rPr>
-        <w:t>Profiling</w:t>
-      </w:r>
-      <w:proofErr w:type="spellEnd"/>
-      <w:r>
-        <w:rPr>
-          <w:rFonts w:cstheme="majorHAnsi"/>
-        </w:rPr>
-        <w:t xml:space="preserve"> statt.</w:t>
+        <w:t>Zum Abschluss und zur Erfüllung des Vertrages mit unserem Kunden findet keine automatisierte Entscheidungsfindung einschließlich Profiling statt.</w:t>
       </w:r>
     </w:p>
     <w:p>
@@ -10820,25 +10463,7 @@
           <w:b/>
           <w:szCs w:val="20"/>
         </w:rPr>
-        <w:t xml:space="preserve">Verarbeitungen, die wir auf die Wahrnehmung einer Aufgabe, die im öffentlichen Interesse i. S. d. Art. 6 Abs. 1 </w:t>
-      </w:r>
-      <w:proofErr w:type="spellStart"/>
-      <w:r>
-        <w:rPr>
-          <w:rFonts w:cstheme="majorHAnsi"/>
-          <w:b/>
-          <w:szCs w:val="20"/>
-        </w:rPr>
-        <w:t>lit</w:t>
-      </w:r>
-      <w:proofErr w:type="spellEnd"/>
-      <w:r>
-        <w:rPr>
-          <w:rFonts w:cstheme="majorHAnsi"/>
-          <w:b/>
-          <w:szCs w:val="20"/>
-        </w:rPr>
-        <w:t>. e) DS GVO liegt, oder auf ein berechtigtes Interesse i. S. d. Art. 6 Abs. 1lit. f) DS-GVO stützen, können Sie uns gegenüber aus Gründen, die sich aus Ihrer besonderen Situation ergeben, jederzeit unter Angabe dieser Gründe widersprechen. Wir werden die personenbezogenen Daten im Falle eines begründeten Widerspruchs grundsätzlich nicht mehr für die betreffenden Zwecke verarbeiten und die Daten löschen, es sei denn, wir können zwingende Gründe für die Verarbeitung nachweisen, die Ihre Interessen, Rechte und Freiheiten überwiegen, oder die Verarbeitung dient der Geltendmachung, Ausübung oder Verteidigung von Rechtsansprüchen.</w:t>
+        <w:t>Verarbeitungen, die wir auf die Wahrnehmung einer Aufgabe, die im öffentlichen Interesse i. S. d. Art. 6 Abs. 1 lit. e) DS GVO liegt, oder auf ein berechtigtes Interesse i. S. d. Art. 6 Abs. 1lit. f) DS-GVO stützen, können Sie uns gegenüber aus Gründen, die sich aus Ihrer besonderen Situation ergeben, jederzeit unter Angabe dieser Gründe widersprechen. Wir werden die personenbezogenen Daten im Falle eines begründeten Widerspruchs grundsätzlich nicht mehr für die betreffenden Zwecke verarbeiten und die Daten löschen, es sei denn, wir können zwingende Gründe für die Verarbeitung nachweisen, die Ihre Interessen, Rechte und Freiheiten überwiegen, oder die Verarbeitung dient der Geltendmachung, Ausübung oder Verteidigung von Rechtsansprüchen.</w:t>
       </w:r>
     </w:p>
     <w:p>
@@ -10900,21 +10525,7 @@
         <w:rPr>
           <w:rFonts w:cstheme="majorHAnsi"/>
         </w:rPr>
-        <w:t xml:space="preserve">ist </w:t>
-      </w:r>
-      <w:proofErr w:type="spellStart"/>
-      <w:r>
-        <w:rPr>
-          <w:rFonts w:cstheme="majorHAnsi"/>
-        </w:rPr>
-        <w:t>heyData</w:t>
-      </w:r>
-      <w:proofErr w:type="spellEnd"/>
-      <w:r>
-        <w:rPr>
-          <w:rFonts w:cstheme="majorHAnsi"/>
-        </w:rPr>
-        <w:t xml:space="preserve"> GmbH, Schützenstraße 5, 10117 Berlin, www.heydata.eu, </w:t>
+        <w:t xml:space="preserve">ist heyData GmbH, Schützenstraße 5, 10117 Berlin, www.heydata.eu, </w:t>
       </w:r>
       <w:hyperlink r:id="rId18" w:history="1">
         <w:r>
@@ -12487,13 +12098,8 @@
             <w:spacing w:line="240" w:lineRule="auto"/>
           </w:pPr>
           <w:r>
-            <w:t xml:space="preserve">Amba </w:t>
+            <w:t>Amba operations</w:t>
           </w:r>
-          <w:proofErr w:type="spellStart"/>
-          <w:r>
-            <w:t>operations</w:t>
-          </w:r>
-          <w:proofErr w:type="spellEnd"/>
           <w:r>
             <w:t xml:space="preserve"> GmbH</w:t>
           </w:r>
@@ -12613,15 +12219,7 @@
             <w:spacing w:line="240" w:lineRule="auto"/>
           </w:pPr>
           <w:r>
-            <w:t xml:space="preserve">Ust – </w:t>
-          </w:r>
-          <w:proofErr w:type="spellStart"/>
-          <w:r>
-            <w:t>IdNr</w:t>
-          </w:r>
-          <w:proofErr w:type="spellEnd"/>
-          <w:r>
-            <w:t>. DE323 85 85 22</w:t>
+            <w:t>Ust – IdNr. DE323 85 85 22</w:t>
           </w:r>
         </w:p>
       </w:tc>
@@ -12832,13 +12430,8 @@
             <w:spacing w:line="240" w:lineRule="auto"/>
           </w:pPr>
           <w:r>
-            <w:t xml:space="preserve">Amba </w:t>
+            <w:t>Amba operations</w:t>
           </w:r>
-          <w:proofErr w:type="spellStart"/>
-          <w:r>
-            <w:t>operations</w:t>
-          </w:r>
-          <w:proofErr w:type="spellEnd"/>
           <w:r>
             <w:t xml:space="preserve"> GmbH</w:t>
           </w:r>
@@ -12958,15 +12551,7 @@
             <w:spacing w:line="240" w:lineRule="auto"/>
           </w:pPr>
           <w:r>
-            <w:t xml:space="preserve">Ust – </w:t>
-          </w:r>
-          <w:proofErr w:type="spellStart"/>
-          <w:r>
-            <w:t>IdNr</w:t>
-          </w:r>
-          <w:proofErr w:type="spellEnd"/>
-          <w:r>
-            <w:t>. DE323 85 85 22</w:t>
+            <w:t>Ust – IdNr. DE323 85 85 22</w:t>
           </w:r>
         </w:p>
       </w:tc>
@@ -16560,12 +16145,7 @@
 </file>
 
 <file path=customXml/item3.xml><?xml version="1.0" encoding="utf-8"?>
-<?mso-contentType ?>
-<FormTemplates xmlns="http://schemas.microsoft.com/sharepoint/v3/contenttype/forms">
-  <Display>DocumentLibraryForm</Display>
-  <Edit>DocumentLibraryForm</Edit>
-  <New>DocumentLibraryForm</New>
-</FormTemplates>
+<b:Sources xmlns:b="http://schemas.openxmlformats.org/officeDocument/2006/bibliography" xmlns="http://schemas.openxmlformats.org/officeDocument/2006/bibliography" SelectedStyle="\APASixthEditionOfficeOnline.xsl" StyleName="APA" Version="6"/>
 </file>
 
 <file path=customXml/item4.xml><?xml version="1.0" encoding="utf-8"?>
@@ -16824,7 +16404,12 @@
 </file>
 
 <file path=customXml/item5.xml><?xml version="1.0" encoding="utf-8"?>
-<b:Sources xmlns:b="http://schemas.openxmlformats.org/officeDocument/2006/bibliography" xmlns="http://schemas.openxmlformats.org/officeDocument/2006/bibliography" SelectedStyle="\APASixthEditionOfficeOnline.xsl" StyleName="APA" Version="6"/>
+<?mso-contentType ?>
+<FormTemplates xmlns="http://schemas.microsoft.com/sharepoint/v3/contenttype/forms">
+  <Display>DocumentLibraryForm</Display>
+  <Edit>DocumentLibraryForm</Edit>
+  <New>DocumentLibraryForm</New>
+</FormTemplates>
 </file>
 
 <file path=customXml/itemProps1.xml><?xml version="1.0" encoding="utf-8"?>
@@ -16847,9 +16432,9 @@
 </file>
 
 <file path=customXml/itemProps3.xml><?xml version="1.0" encoding="utf-8"?>
-<ds:datastoreItem xmlns:ds="http://schemas.openxmlformats.org/officeDocument/2006/customXml" ds:itemID="{846A5F5F-0CE6-4451-8402-A8F05F356EE1}">
+<ds:datastoreItem xmlns:ds="http://schemas.openxmlformats.org/officeDocument/2006/customXml" ds:itemID="{0E70647D-1F0C-48C2-B100-F272D9CEE62E}">
   <ds:schemaRefs>
-    <ds:schemaRef ds:uri="http://schemas.microsoft.com/sharepoint/v3/contenttype/forms"/>
+    <ds:schemaRef ds:uri="http://schemas.openxmlformats.org/officeDocument/2006/bibliography"/>
   </ds:schemaRefs>
 </ds:datastoreItem>
 </file>
@@ -16874,9 +16459,9 @@
 </file>
 
 <file path=customXml/itemProps5.xml><?xml version="1.0" encoding="utf-8"?>
-<ds:datastoreItem xmlns:ds="http://schemas.openxmlformats.org/officeDocument/2006/customXml" ds:itemID="{0E70647D-1F0C-48C2-B100-F272D9CEE62E}">
+<ds:datastoreItem xmlns:ds="http://schemas.openxmlformats.org/officeDocument/2006/customXml" ds:itemID="{846A5F5F-0CE6-4451-8402-A8F05F356EE1}">
   <ds:schemaRefs>
-    <ds:schemaRef ds:uri="http://schemas.openxmlformats.org/officeDocument/2006/bibliography"/>
+    <ds:schemaRef ds:uri="http://schemas.microsoft.com/sharepoint/v3/contenttype/forms"/>
   </ds:schemaRefs>
 </ds:datastoreItem>
 </file>
</xml_diff>